<commit_message>
use fictional organization name
</commit_message>
<xml_diff>
--- a/corpus/CDC-2023-103_reseau.docx
+++ b/corpus/CDC-2023-103_reseau.docx
@@ -74,7 +74,7 @@
         <w:t xml:space="preserve">Maître d'ouvrage : </w:t>
       </w:r>
       <w:r>
-        <w:t>Groupe EB — Direction des Systèmes d'Information</w:t>
+        <w:t>Société Exemple — Direction des Systèmes d'Information</w:t>
       </w:r>
     </w:p>
     <w:p>
@@ -92,17 +92,17 @@
     </w:p>
     <w:p>
       <w:r>
-        <w:t>Le Groupe EB emploie plus de 2500 collaborateurs répartis sur 12 sites au Maroc. La Direction des Systèmes d'Information pilote l'ensemble des projets d'évolution du système d'information pour le compte des directions métier.</w:t>
+        <w:t>La Société Exemple emploie plus de 2500 collaborateurs répartis sur 12 sites au Maroc. La Direction des Systèmes d'Information pilote l'ensemble des projets d'évolution du système d'information pour le compte des directions métier.</w:t>
       </w:r>
     </w:p>
     <w:p>
       <w:r>
-        <w:t>Dans le cadre de son plan stratégique 2024-2027, le Groupe EB poursuit la modernisation de son système d'information afin de soutenir la croissance de ses activités et d'améliorer la qualité de service rendue à ses clients internes et externes.</w:t>
+        <w:t>Dans le cadre de son plan stratégique 2024-2027, le La Société Exemple poursuit la modernisation de son système d'information afin de soutenir la croissance de ses activités et d'améliorer la qualité de service rendue à ses clients internes et externes.</w:t>
       </w:r>
     </w:p>
     <w:p>
       <w:r>
-        <w:t>La présente consultation s'inscrit dans une démarche de renforcement de la résilience et de la performance des services informatiques du Groupe EB, engagée depuis 8 ans à l'initiative de la Direction Générale.</w:t>
+        <w:t>La présente consultation s'inscrit dans une démarche de renforcement de la résilience et de la performance des services informatiques du La Société Exemple, engagée depuis 8 ans à l'initiative de la Direction Générale.</w:t>
       </w:r>
     </w:p>
     <w:p>
@@ -135,7 +135,7 @@
     </w:p>
     <w:p>
       <w:r>
-        <w:t>Ce document constitue le cahier des charges de la consultation lancée par la Direction des Systèmes d'Information du Groupe EB pour la prestation suivante : Mise en place d'un réseau Wi-Fi haute densité au centre de formation de Fès. Il engage le prestataire retenu sur l'ensemble des exigences, des délais et des niveaux de service qui y sont énoncés, pour toute la durée du marché.</w:t>
+        <w:t>Ce document constitue le cahier des charges de la consultation lancée par la Direction des Systèmes d'Information de la Société Exemple pour la prestation suivante : Mise en place d'un réseau Wi-Fi haute densité au centre de formation de Fès. Il engage le prestataire retenu sur l'ensemble des exigences, des délais et des niveaux de service qui y sont énoncés, pour toute la durée du marché.</w:t>
       </w:r>
     </w:p>
     <w:p>
@@ -158,12 +158,12 @@
     </w:p>
     <w:p>
       <w:r>
-        <w:t>- Formation des équipes techniques internes. Cette prestation est réalisée selon les standards internes du Groupe EB et documentée en conséquence.</w:t>
+        <w:t>- Formation des équipes techniques internes. Cette prestation est réalisée selon les standards internes de la Société Exemple et documentée en conséquence.</w:t>
       </w:r>
     </w:p>
     <w:p>
       <w:r>
-        <w:t>- Accompagnement lors de la bascule en production. Cette prestation est réalisée selon les standards internes du Groupe EB et documentée en conséquence.</w:t>
+        <w:t>- Accompagnement lors de la bascule en production. Cette prestation est réalisée selon les standards internes de la Société Exemple et documentée en conséquence.</w:t>
       </w:r>
     </w:p>
     <w:p>
@@ -188,12 +188,12 @@
     </w:p>
     <w:p>
       <w:r>
-        <w:t>- Câblage et raccordement conformes aux normes en vigueur. Le Groupe EB désigne un interlocuteur référent pour valider cette activité.</w:t>
+        <w:t>- Câblage et raccordement conformes aux normes en vigueur. La Société Exemple désigne un interlocuteur référent pour valider cette activité.</w:t>
       </w:r>
     </w:p>
     <w:p>
       <w:r>
-        <w:t>- Paramétrage de la supervision et des alertes. Le Groupe EB désigne un interlocuteur référent pour valider cette activité.</w:t>
+        <w:t>- Paramétrage de la supervision et des alertes. La Société Exemple désigne un interlocuteur référent pour valider cette activité.</w:t>
       </w:r>
     </w:p>
     <w:p>
@@ -203,7 +203,7 @@
     </w:p>
     <w:p>
       <w:r>
-        <w:t>- La formation de personnel autre que les équipes désignées par le Groupe EB.</w:t>
+        <w:t>- La formation de personnel autre que les équipes désignées par la Société Exemple.</w:t>
       </w:r>
     </w:p>
     <w:p>
@@ -218,7 +218,7 @@
     </w:p>
     <w:p>
       <w:r>
-        <w:t>- La fourniture de postes de travail ou d'équipements bureautiques standards du Groupe EB.</w:t>
+        <w:t>- La fourniture de postes de travail ou d'équipements bureautiques standards de la Société Exemple.</w:t>
       </w:r>
     </w:p>
     <w:p>
@@ -236,7 +236,7 @@
     </w:p>
     <w:p>
       <w:r>
-        <w:t>Aucune redondance automatique n'est aujourd'hui en place entre les principaux sites, ce qui expose le Groupe EB à une interruption totale de service en cas de rupture d'un lien critique.</w:t>
+        <w:t>Aucune redondance automatique n'est aujourd'hui en place entre les principaux sites, ce qui expose la Société Exemple à une interruption totale de service en cas de rupture d'un lien critique.</w:t>
       </w:r>
     </w:p>
     <w:p>
@@ -264,7 +264,7 @@
     </w:p>
     <w:p>
       <w:r>
-        <w:t>EF-01. La solution retenue doit garantir la bascule automatique vers le lien de secours en cas de rupture du lien principal, sans intervention manuelle. Cette exigence vise à réduire le risque opérationnel identifié sur le périmètre actuel. Le non-respect constaté de cette exigence ouvre un délai de reprise avant réception. L'absence de cette fonctionnalité expose le Groupe EB à un risque opérationnel jugé significatif par la Direction des Systèmes d'Information.</w:t>
+        <w:t>EF-01. La solution retenue doit garantir la bascule automatique vers le lien de secours en cas de rupture du lien principal, sans intervention manuelle. Cette exigence vise à réduire le risque opérationnel identifié sur le périmètre actuel. Le non-respect constaté de cette exigence ouvre un délai de reprise avant réception. L'absence de cette fonctionnalité expose la Société Exemple à un risque opérationnel jugé significatif par la Direction des Systèmes d'Information.</w:t>
       </w:r>
     </w:p>
     <w:p>
@@ -274,7 +274,7 @@
     </w:p>
     <w:p>
       <w:r>
-        <w:t>EF-03. La solution retenue doit être disponible en français, langue de travail du Groupe EB, pour l'ensemble des écrans et documents livrés. Cette exigence répond à un besoin exprimé par les utilisateurs métier lors des ateliers de cadrage. Le prestataire documente la mise en œuvre de cette exigence dans le dossier de recette. Le Groupe EB se réserve le droit de demander une démonstration anticipée de cette fonctionnalité avant la commande ferme.</w:t>
+        <w:t>EF-03. La solution retenue doit être disponible en français, langue de travail de la Société Exemple, pour l'ensemble des écrans et documents livrés. Cette exigence répond à un besoin exprimé par les utilisateurs métier lors des ateliers de cadrage. Le prestataire documente la mise en œuvre de cette exigence dans le dossier de recette. La Société Exemple se réserve le droit de demander une démonstration anticipée de cette fonctionnalité avant la commande ferme.</w:t>
       </w:r>
     </w:p>
     <w:p>
@@ -284,17 +284,17 @@
     </w:p>
     <w:p>
       <w:r>
-        <w:t>EF-05. Le système doit fournir un mécanisme de restauration après incident sans perte de données au-delà de l'objectif de point de reprise convenu. Cette exigence conditionne l'adhésion des utilisateurs finaux à la nouvelle solution. Cette exigence est vérifiée lors de la recette technique, sur la base d'un scénario de test documenté. L'absence de cette fonctionnalité expose le Groupe EB à un risque opérationnel jugé significatif par la Direction des Systèmes d'Information.</w:t>
+        <w:t>EF-05. Le système doit fournir un mécanisme de restauration après incident sans perte de données au-delà de l'objectif de point de reprise convenu. Cette exigence conditionne l'adhésion des utilisateurs finaux à la nouvelle solution. Cette exigence est vérifiée lors de la recette technique, sur la base d'un scénario de test documenté. L'absence de cette fonctionnalité expose la Société Exemple à un risque opérationnel jugé significatif par la Direction des Systèmes d'Information.</w:t>
       </w:r>
     </w:p>
     <w:p>
       <w:r>
-        <w:t>EF-06. L'outil déployé doit fournir une documentation d'exploitation permettant aux équipes internes d'assurer le support de premier niveau. Cette exigence vise à réduire le risque opérationnel identifié sur le périmètre actuel. Cette exigence est tracée dans la matrice de conformité remise avec l'offre. L'absence de cette fonctionnalité expose le Groupe EB à un risque opérationnel jugé significatif par la Direction des Systèmes d'Information.</w:t>
+        <w:t>EF-06. L'outil déployé doit fournir une documentation d'exploitation permettant aux équipes internes d'assurer le support de premier niveau. Cette exigence vise à réduire le risque opérationnel identifié sur le périmètre actuel. Cette exigence est tracée dans la matrice de conformité remise avec l'offre. L'absence de cette fonctionnalité expose la Société Exemple à un risque opérationnel jugé significatif par la Direction des Systèmes d'Information.</w:t>
       </w:r>
     </w:p>
     <w:p>
       <w:r>
-        <w:t>EF-07. L'application livrée doit permettre l'archivage des données selon une durée de conservation conforme aux obligations légales applicables. Cette exigence est jugée prioritaire par la Direction des Systèmes d'Information. Cette exigence est tracée dans la matrice de conformité remise avec l'offre. Le Groupe EB se réserve le droit de demander une démonstration anticipée de cette fonctionnalité avant la commande ferme.</w:t>
+        <w:t>EF-07. L'application livrée doit permettre l'archivage des données selon une durée de conservation conforme aux obligations légales applicables. Cette exigence est jugée prioritaire par la Direction des Systèmes d'Information. Cette exigence est tracée dans la matrice de conformité remise avec l'offre. La Société Exemple se réserve le droit de demander une démonstration anticipée de cette fonctionnalité avant la commande ferme.</w:t>
       </w:r>
     </w:p>
     <w:p>
@@ -304,22 +304,22 @@
     </w:p>
     <w:p>
       <w:r>
-        <w:t>EF-09. L'outil déployé doit permettre la segmentation logique du trafic par direction métier, avec des règles de filtrage indépendantes. Cette exigence s'inscrit dans la politique de sécurité du Groupe EB. Le respect de cette exigence conditionne le prononcé de la réception provisoire. L'absence de cette fonctionnalité expose le Groupe EB à un risque opérationnel jugé significatif par la Direction des Systèmes d'Information.</w:t>
+        <w:t>EF-09. L'outil déployé doit permettre la segmentation logique du trafic par direction métier, avec des règles de filtrage indépendantes. Cette exigence s'inscrit dans la politique de sécurité de la Société Exemple. Le respect de cette exigence conditionne le prononcé de la réception provisoire. L'absence de cette fonctionnalité expose la Société Exemple à un risque opérationnel jugé significatif par la Direction des Systèmes d'Information.</w:t>
       </w:r>
     </w:p>
     <w:p>
       <w:r>
-        <w:t>EF-10. La solution retenue doit fournir une documentation d'exploitation permettant aux équipes internes d'assurer le support de premier niveau. Cette exigence découle des limites constatées sur la solution actuelle, décrites au chapitre Analyse de l'existant. La démonstration de cette exigence est intégrée au plan de tests de recette. L'absence de cette fonctionnalité expose le Groupe EB à un risque opérationnel jugé significatif par la Direction des Systèmes d'Information.</w:t>
+        <w:t>EF-10. La solution retenue doit fournir une documentation d'exploitation permettant aux équipes internes d'assurer le support de premier niveau. Cette exigence découle des limites constatées sur la solution actuelle, décrites au chapitre Analyse de l'existant. La démonstration de cette exigence est intégrée au plan de tests de recette. L'absence de cette fonctionnalité expose la Société Exemple à un risque opérationnel jugé significatif par la Direction des Systèmes d'Information.</w:t>
       </w:r>
     </w:p>
     <w:p>
       <w:r>
-        <w:t>EF-11. Le dispositif mis en œuvre doit permettre l'ajout d'un nouveau site raccordé sans interruption de service sur les sites existants. Cette exigence s'inscrit dans la politique de sécurité du Groupe EB. Le prestataire documente la mise en œuvre de cette exigence dans le dossier de recette. Cette exigence a un impact direct sur l'expérience quotidienne des utilisateurs finaux du système.</w:t>
+        <w:t>EF-11. Le dispositif mis en œuvre doit permettre l'ajout d'un nouveau site raccordé sans interruption de service sur les sites existants. Cette exigence s'inscrit dans la politique de sécurité de la Société Exemple. Le prestataire documente la mise en œuvre de cette exigence dans le dossier de recette. Cette exigence a un impact direct sur l'expérience quotidienne des utilisateurs finaux du système.</w:t>
       </w:r>
     </w:p>
     <w:p>
       <w:r>
-        <w:t>EF-12. La solution retenue doit journaliser toute modification de configuration des équipements actifs, avec horodatage et identification de l'auteur. Cette exigence vise à réduire le risque opérationnel identifié sur le périmètre actuel. Cette exigence est tracée dans la matrice de conformité remise avec l'offre. Le Groupe EB se réserve le droit de demander une démonstration anticipée de cette fonctionnalité avant la commande ferme.</w:t>
+        <w:t>EF-12. La solution retenue doit journaliser toute modification de configuration des équipements actifs, avec horodatage et identification de l'auteur. Cette exigence vise à réduire le risque opérationnel identifié sur le périmètre actuel. Cette exigence est tracée dans la matrice de conformité remise avec l'offre. La Société Exemple se réserve le droit de demander une démonstration anticipée de cette fonctionnalité avant la commande ferme.</w:t>
       </w:r>
     </w:p>
     <w:p>
@@ -329,7 +329,7 @@
     </w:p>
     <w:p>
       <w:r>
-        <w:t>EF-14. Le dispositif mis en œuvre doit garantir la conformité au Règlement Général sur la Protection des Données pour tout traitement de données à caractère personnel. Cette exigence s'inscrit dans la politique de sécurité du Groupe EB. La démonstration de cette exigence est intégrée au plan de tests de recette. Cette exigence est reprise telle quelle dans le contrat final, sauf négociation explicite actée par écrit entre les parties.</w:t>
+        <w:t>EF-14. Le dispositif mis en œuvre doit garantir la conformité au Règlement Général sur la Protection des Données pour tout traitement de données à caractère personnel. Cette exigence s'inscrit dans la politique de sécurité de la Société Exemple. La démonstration de cette exigence est intégrée au plan de tests de recette. Cette exigence est reprise telle quelle dans le contrat final, sauf négociation explicite actée par écrit entre les parties.</w:t>
       </w:r>
     </w:p>
     <w:p>
@@ -349,12 +349,12 @@
     </w:p>
     <w:p>
       <w:r>
-        <w:t>EF-18. L'application livrée doit détecter automatiquement toute tentative de connexion non autorisée sur les équipements actifs. Cette exigence s'inscrit dans la politique de sécurité du Groupe EB. Cette exigence est vérifiée lors de la recette technique, sur la base d'un scénario de test documenté. Le Groupe EB se réserve le droit de demander une démonstration anticipée de cette fonctionnalité avant la commande ferme.</w:t>
+        <w:t>EF-18. L'application livrée doit détecter automatiquement toute tentative de connexion non autorisée sur les équipements actifs. Cette exigence s'inscrit dans la politique de sécurité de la Société Exemple. Cette exigence est vérifiée lors de la recette technique, sur la base d'un scénario de test documenté. La Société Exemple se réserve le droit de demander une démonstration anticipée de cette fonctionnalité avant la commande ferme.</w:t>
       </w:r>
     </w:p>
     <w:p>
       <w:r>
-        <w:t>EF-19. L'application livrée doit journaliser l'ensemble des opérations sensibles, avec conservation des journaux pendant une durée conforme à la politique interne du Groupe EB. Cette exigence répond à un besoin exprimé par les utilisateurs métier lors des ateliers de cadrage. Cette exigence fait l'objet d'un contrôle contradictoire entre le prestataire et les équipes du Groupe EB. Cette exigence est reprise telle quelle dans le contrat final, sauf négociation explicite actée par écrit entre les parties.</w:t>
+        <w:t>EF-19. L'application livrée doit journaliser l'ensemble des opérations sensibles, avec conservation des journaux pendant une durée conforme à la politique interne de la Société Exemple. Cette exigence répond à un besoin exprimé par les utilisateurs métier lors des ateliers de cadrage. Cette exigence fait l'objet d'un contrôle contradictoire entre le prestataire et les équipes de la Société Exemple. Cette exigence est reprise telle quelle dans le contrat final, sauf négociation explicite actée par écrit entre les parties.</w:t>
       </w:r>
     </w:p>
     <w:p>
@@ -369,7 +369,7 @@
     </w:p>
     <w:p>
       <w:r>
-        <w:t>EF-22. Le système doit permettre la segmentation logique du trafic par direction métier, avec des règles de filtrage indépendantes. Cette exigence répond à un besoin exprimé par les utilisateurs métier lors des ateliers de cadrage. Cette exigence est validée par un test fonctionnel réalisé en présence d'un représentant du Groupe EB. Cette exigence a un impact direct sur l'expérience quotidienne des utilisateurs finaux du système.</w:t>
+        <w:t>EF-22. Le système doit permettre la segmentation logique du trafic par direction métier, avec des règles de filtrage indépendantes. Cette exigence répond à un besoin exprimé par les utilisateurs métier lors des ateliers de cadrage. Cette exigence est validée par un test fonctionnel réalisé en présence d'un représentant de la Société Exemple. Cette exigence a un impact direct sur l'expérience quotidienne des utilisateurs finaux du système.</w:t>
       </w:r>
     </w:p>
     <w:p>
@@ -384,42 +384,42 @@
     </w:p>
     <w:p>
       <w:r>
-        <w:t>EF-25. Le dispositif mis en œuvre doit garantir la bascule automatique vers le lien de secours en cas de rupture du lien principal, sans intervention manuelle. Cette exigence vise à réduire le risque opérationnel identifié sur le périmètre actuel. Le non-respect constaté de cette exigence ouvre un délai de reprise avant réception. L'absence de cette fonctionnalité expose le Groupe EB à un risque opérationnel jugé significatif par la Direction des Systèmes d'Information.</w:t>
+        <w:t>EF-25. Le dispositif mis en œuvre doit garantir la bascule automatique vers le lien de secours en cas de rupture du lien principal, sans intervention manuelle. Cette exigence vise à réduire le risque opérationnel identifié sur le périmètre actuel. Le non-respect constaté de cette exigence ouvre un délai de reprise avant réception. L'absence de cette fonctionnalité expose la Société Exemple à un risque opérationnel jugé significatif par la Direction des Systèmes d'Information.</w:t>
       </w:r>
     </w:p>
     <w:p>
       <w:r>
-        <w:t>EF-26. Le dispositif mis en œuvre doit permettre la sauvegarde régulière des données selon une politique définie conjointement avec la Direction des Systèmes d'Information. Cette exigence vise à réduire le risque opérationnel identifié sur le périmètre actuel. Cette exigence est tracée dans la matrice de conformité remise avec l'offre. Le Groupe EB se réserve le droit de demander une démonstration anticipée de cette fonctionnalité avant la commande ferme.</w:t>
+        <w:t>EF-26. Le dispositif mis en œuvre doit permettre la sauvegarde régulière des données selon une politique définie conjointement avec la Direction des Systèmes d'Information. Cette exigence vise à réduire le risque opérationnel identifié sur le périmètre actuel. Cette exigence est tracée dans la matrice de conformité remise avec l'offre. La Société Exemple se réserve le droit de demander une démonstration anticipée de cette fonctionnalité avant la commande ferme.</w:t>
       </w:r>
     </w:p>
     <w:p>
       <w:r>
-        <w:t>EF-27. Le dispositif mis en œuvre doit journaliser toute modification de configuration des équipements actifs, avec horodatage et identification de l'auteur. Cette exigence découle des limites constatées sur la solution actuelle, décrites au chapitre Analyse de l'existant. Cette exigence fait l'objet d'un contrôle contradictoire entre le prestataire et les équipes du Groupe EB. Cette exigence a un impact direct sur l'expérience quotidienne des utilisateurs finaux du système.</w:t>
+        <w:t>EF-27. Le dispositif mis en œuvre doit journaliser toute modification de configuration des équipements actifs, avec horodatage et identification de l'auteur. Cette exigence découle des limites constatées sur la solution actuelle, décrites au chapitre Analyse de l'existant. Cette exigence fait l'objet d'un contrôle contradictoire entre le prestataire et les équipes de la Société Exemple. Cette exigence a un impact direct sur l'expérience quotidienne des utilisateurs finaux du système.</w:t>
       </w:r>
     </w:p>
     <w:p>
       <w:r>
-        <w:t>EF-28. Le dispositif mis en œuvre doit permettre la définition de profils d'accès distincts selon le rôle de l'utilisateur. Cette exigence répond à un besoin exprimé par les utilisateurs métier lors des ateliers de cadrage. La démonstration de cette exigence est intégrée au plan de tests de recette. L'absence de cette fonctionnalité expose le Groupe EB à un risque opérationnel jugé significatif par la Direction des Systèmes d'Information.</w:t>
+        <w:t>EF-28. Le dispositif mis en œuvre doit permettre la définition de profils d'accès distincts selon le rôle de l'utilisateur. Cette exigence répond à un besoin exprimé par les utilisateurs métier lors des ateliers de cadrage. La démonstration de cette exigence est intégrée au plan de tests de recette. L'absence de cette fonctionnalité expose la Société Exemple à un risque opérationnel jugé significatif par la Direction des Systèmes d'Information.</w:t>
       </w:r>
     </w:p>
     <w:p>
       <w:r>
-        <w:t>EF-29. La solution retenue doit détecter automatiquement toute tentative de connexion non autorisée sur les équipements actifs. Cette exigence découle des limites constatées sur la solution actuelle, décrites au chapitre Analyse de l'existant. Cette exigence fait l'objet d'un contrôle contradictoire entre le prestataire et les équipes du Groupe EB. Le prestataire décrit dans son offre la manière dont il compte répondre à cette exigence, avec le niveau de détail attendu pour une consultation de ce type.</w:t>
+        <w:t>EF-29. La solution retenue doit détecter automatiquement toute tentative de connexion non autorisée sur les équipements actifs. Cette exigence découle des limites constatées sur la solution actuelle, décrites au chapitre Analyse de l'existant. Cette exigence fait l'objet d'un contrôle contradictoire entre le prestataire et les équipes de la Société Exemple. Le prestataire décrit dans son offre la manière dont il compte répondre à cette exigence, avec le niveau de détail attendu pour une consultation de ce type.</w:t>
       </w:r>
     </w:p>
     <w:p>
       <w:r>
-        <w:t>EF-30. La solution retenue doit permettre l'archivage des données selon une durée de conservation conforme aux obligations légales applicables. Cette exigence est jugée prioritaire par la Direction des Systèmes d'Information. Cette exigence est validée par un test fonctionnel réalisé en présence d'un représentant du Groupe EB. Le Groupe EB se réserve le droit de demander une démonstration anticipée de cette fonctionnalité avant la commande ferme.</w:t>
+        <w:t>EF-30. La solution retenue doit permettre l'archivage des données selon une durée de conservation conforme aux obligations légales applicables. Cette exigence est jugée prioritaire par la Direction des Systèmes d'Information. Cette exigence est validée par un test fonctionnel réalisé en présence d'un représentant de la Société Exemple. La Société Exemple se réserve le droit de demander une démonstration anticipée de cette fonctionnalité avant la commande ferme.</w:t>
       </w:r>
     </w:p>
     <w:p>
       <w:r>
-        <w:t>EF-31. Le dispositif mis en œuvre doit permettre la supervision en temps réel de l'état de chaque lien inter-sites, avec remontée d'alerte automatique en cas de dégradation. Cette exigence s'inscrit dans la politique de sécurité du Groupe EB. Cette exigence est vérifiée lors de la recette technique, sur la base d'un scénario de test documenté. Le Groupe EB se réserve le droit de demander une démonstration anticipée de cette fonctionnalité avant la commande ferme.</w:t>
+        <w:t>EF-31. Le dispositif mis en œuvre doit permettre la supervision en temps réel de l'état de chaque lien inter-sites, avec remontée d'alerte automatique en cas de dégradation. Cette exigence s'inscrit dans la politique de sécurité de la Société Exemple. Cette exigence est vérifiée lors de la recette technique, sur la base d'un scénario de test documenté. La Société Exemple se réserve le droit de demander une démonstration anticipée de cette fonctionnalité avant la commande ferme.</w:t>
       </w:r>
     </w:p>
     <w:p>
       <w:r>
-        <w:t>EF-32. L'outil déployé doit permettre la définition de profils d'accès distincts selon le rôle de l'utilisateur. Cette exigence vise à réduire le risque opérationnel identifié sur le périmètre actuel. La démonstration de cette exigence est intégrée au plan de tests de recette. L'absence de cette fonctionnalité expose le Groupe EB à un risque opérationnel jugé significatif par la Direction des Systèmes d'Information.</w:t>
+        <w:t>EF-32. L'outil déployé doit permettre la définition de profils d'accès distincts selon le rôle de l'utilisateur. Cette exigence vise à réduire le risque opérationnel identifié sur le périmètre actuel. La démonstration de cette exigence est intégrée au plan de tests de recette. L'absence de cette fonctionnalité expose la Société Exemple à un risque opérationnel jugé significatif par la Direction des Systèmes d'Information.</w:t>
       </w:r>
     </w:p>
     <w:p>
@@ -434,12 +434,12 @@
     </w:p>
     <w:p>
       <w:r>
-        <w:t>EF-35. Le système doit être disponible en français, langue de travail du Groupe EB, pour l'ensemble des écrans et documents livrés. Cette exigence est jugée prioritaire par la Direction des Systèmes d'Information. Cette exigence fait l'objet d'un contrôle contradictoire entre le prestataire et les équipes du Groupe EB. Cette exigence a un impact direct sur l'expérience quotidienne des utilisateurs finaux du système.</w:t>
+        <w:t>EF-35. Le système doit être disponible en français, langue de travail de la Société Exemple, pour l'ensemble des écrans et documents livrés. Cette exigence est jugée prioritaire par la Direction des Systèmes d'Information. Cette exigence fait l'objet d'un contrôle contradictoire entre le prestataire et les équipes de la Société Exemple. Cette exigence a un impact direct sur l'expérience quotidienne des utilisateurs finaux du système.</w:t>
       </w:r>
     </w:p>
     <w:p>
       <w:r>
-        <w:t>EF-36. L'application livrée doit être disponible en français, langue de travail du Groupe EB, pour l'ensemble des écrans et documents livrés. Cette exigence découle des limites constatées sur la solution actuelle, décrites au chapitre Analyse de l'existant. Le prestataire documente la mise en œuvre de cette exigence dans le dossier de recette. Cette exigence a un impact direct sur l'expérience quotidienne des utilisateurs finaux du système.</w:t>
+        <w:t>EF-36. L'application livrée doit être disponible en français, langue de travail de la Société Exemple, pour l'ensemble des écrans et documents livrés. Cette exigence découle des limites constatées sur la solution actuelle, décrites au chapitre Analyse de l'existant. Le prestataire documente la mise en œuvre de cette exigence dans le dossier de recette. Cette exigence a un impact direct sur l'expérience quotidienne des utilisateurs finaux du système.</w:t>
       </w:r>
     </w:p>
     <w:p>
@@ -449,32 +449,32 @@
     </w:p>
     <w:p>
       <w:r>
-        <w:t>EF-38. La solution retenue doit journaliser l'ensemble des opérations sensibles, avec conservation des journaux pendant une durée conforme à la politique interne du Groupe EB. Cette exigence répond à un besoin exprimé par les utilisateurs métier lors des ateliers de cadrage. Cette exigence est vérifiée lors de la recette technique, sur la base d'un scénario de test documenté. Une réponse partielle à cette exigence doit être explicitement signalée et justifiée dans l'offre du prestataire.</w:t>
+        <w:t>EF-38. La solution retenue doit journaliser l'ensemble des opérations sensibles, avec conservation des journaux pendant une durée conforme à la politique interne de la Société Exemple. Cette exigence répond à un besoin exprimé par les utilisateurs métier lors des ateliers de cadrage. Cette exigence est vérifiée lors de la recette technique, sur la base d'un scénario de test documenté. Une réponse partielle à cette exigence doit être explicitement signalée et justifiée dans l'offre du prestataire.</w:t>
       </w:r>
     </w:p>
     <w:p>
       <w:r>
-        <w:t>EF-39. L'application livrée doit restituer, sur demande du Groupe EB, un état complet des habilitations actives à un instant donné. Cette exigence vise à réduire le risque opérationnel identifié sur le périmètre actuel. Le non-respect constaté de cette exigence ouvre un délai de reprise avant réception. Une réponse partielle à cette exigence doit être explicitement signalée et justifiée dans l'offre du prestataire.</w:t>
+        <w:t>EF-39. L'application livrée doit restituer, sur demande de la Société Exemple, un état complet des habilitations actives à un instant donné. Cette exigence vise à réduire le risque opérationnel identifié sur le périmètre actuel. Le non-respect constaté de cette exigence ouvre un délai de reprise avant réception. Une réponse partielle à cette exigence doit être explicitement signalée et justifiée dans l'offre du prestataire.</w:t>
       </w:r>
     </w:p>
     <w:p>
       <w:r>
-        <w:t>EF-40. L'application livrée doit fournir un mécanisme de restauration après incident sans perte de données au-delà de l'objectif de point de reprise convenu. Cette exigence est jugée prioritaire par la Direction des Systèmes d'Information. Le non-respect constaté de cette exigence ouvre un délai de reprise avant réception. L'absence de cette fonctionnalité expose le Groupe EB à un risque opérationnel jugé significatif par la Direction des Systèmes d'Information.</w:t>
+        <w:t>EF-40. L'application livrée doit fournir un mécanisme de restauration après incident sans perte de données au-delà de l'objectif de point de reprise convenu. Cette exigence est jugée prioritaire par la Direction des Systèmes d'Information. Le non-respect constaté de cette exigence ouvre un délai de reprise avant réception. L'absence de cette fonctionnalité expose la Société Exemple à un risque opérationnel jugé significatif par la Direction des Systèmes d'Information.</w:t>
       </w:r>
     </w:p>
     <w:p>
       <w:r>
-        <w:t>EF-41. Le dispositif mis en œuvre doit restituer, sur demande du Groupe EB, un état complet des habilitations actives à un instant donné. Cette exigence vise à réduire le risque opérationnel identifié sur le périmètre actuel. Le respect de cette exigence conditionne le prononcé de la réception provisoire. L'absence de cette fonctionnalité expose le Groupe EB à un risque opérationnel jugé significatif par la Direction des Systèmes d'Information.</w:t>
+        <w:t>EF-41. Le dispositif mis en œuvre doit restituer, sur demande de la Société Exemple, un état complet des habilitations actives à un instant donné. Cette exigence vise à réduire le risque opérationnel identifié sur le périmètre actuel. Le respect de cette exigence conditionne le prononcé de la réception provisoire. L'absence de cette fonctionnalité expose la Société Exemple à un risque opérationnel jugé significatif par la Direction des Systèmes d'Information.</w:t>
       </w:r>
     </w:p>
     <w:p>
       <w:r>
-        <w:t>EF-42. L'outil déployé doit être disponible en français, langue de travail du Groupe EB, pour l'ensemble des écrans et documents livrés. Cette exigence s'inscrit dans la politique de sécurité du Groupe EB. La démonstration de cette exigence est intégrée au plan de tests de recette. Une réponse partielle à cette exigence doit être explicitement signalée et justifiée dans l'offre du prestataire.</w:t>
+        <w:t>EF-42. L'outil déployé doit être disponible en français, langue de travail de la Société Exemple, pour l'ensemble des écrans et documents livrés. Cette exigence s'inscrit dans la politique de sécurité de la Société Exemple. La démonstration de cette exigence est intégrée au plan de tests de recette. Une réponse partielle à cette exigence doit être explicitement signalée et justifiée dans l'offre du prestataire.</w:t>
       </w:r>
     </w:p>
     <w:p>
       <w:r>
-        <w:t>EF-43. Le dispositif mis en œuvre doit fournir un mécanisme de restauration après incident sans perte de données au-delà de l'objectif de point de reprise convenu. Cette exigence s'inscrit dans la politique de sécurité du Groupe EB. Le prestataire documente la mise en œuvre de cette exigence dans le dossier de recette. Une réponse partielle à cette exigence doit être explicitement signalée et justifiée dans l'offre du prestataire.</w:t>
+        <w:t>EF-43. Le dispositif mis en œuvre doit fournir un mécanisme de restauration après incident sans perte de données au-delà de l'objectif de point de reprise convenu. Cette exigence s'inscrit dans la politique de sécurité de la Société Exemple. Le prestataire documente la mise en œuvre de cette exigence dans le dossier de recette. Une réponse partielle à cette exigence doit être explicitement signalée et justifiée dans l'offre du prestataire.</w:t>
       </w:r>
     </w:p>
     <w:p>
@@ -484,17 +484,17 @@
     </w:p>
     <w:p>
       <w:r>
-        <w:t>EF-45. La solution retenue doit permettre la sauvegarde automatisée des configurations de l'ensemble des équipements actifs. Cette exigence répond à un besoin exprimé par les utilisateurs métier lors des ateliers de cadrage. Le respect de cette exigence conditionne le prononcé de la réception provisoire. Le Groupe EB se réserve le droit de demander une démonstration anticipée de cette fonctionnalité avant la commande ferme.</w:t>
+        <w:t>EF-45. La solution retenue doit permettre la sauvegarde automatisée des configurations de l'ensemble des équipements actifs. Cette exigence répond à un besoin exprimé par les utilisateurs métier lors des ateliers de cadrage. Le respect de cette exigence conditionne le prononcé de la réception provisoire. La Société Exemple se réserve le droit de demander une démonstration anticipée de cette fonctionnalité avant la commande ferme.</w:t>
       </w:r>
     </w:p>
     <w:p>
       <w:r>
-        <w:t>EF-46. La solution retenue doit restituer, sur demande du Groupe EB, un état complet des habilitations actives à un instant donné. Cette exigence contribue directement aux objectifs de qualité de service fixés pour la prestation. La démonstration de cette exigence est intégrée au plan de tests de recette. Cette exigence a un impact direct sur l'expérience quotidienne des utilisateurs finaux du système.</w:t>
+        <w:t>EF-46. La solution retenue doit restituer, sur demande de la Société Exemple, un état complet des habilitations actives à un instant donné. Cette exigence contribue directement aux objectifs de qualité de service fixés pour la prestation. La démonstration de cette exigence est intégrée au plan de tests de recette. Cette exigence a un impact direct sur l'expérience quotidienne des utilisateurs finaux du système.</w:t>
       </w:r>
     </w:p>
     <w:p>
       <w:r>
-        <w:t>EF-47. L'application livrée doit permettre la révocation immédiate des droits d'un utilisateur quittant le Groupe EB. Cette exigence a été formulée à la suite des incidents constatés sur le système actuel. La conformité à cette exigence est un préalable à la levée des réserves de réception. Cette exigence est reprise telle quelle dans le contrat final, sauf négociation explicite actée par écrit entre les parties.</w:t>
+        <w:t>EF-47. L'application livrée doit permettre la révocation immédiate des droits d'un utilisateur quittant la Société Exemple. Cette exigence a été formulée à la suite des incidents constatés sur le système actuel. La conformité à cette exigence est un préalable à la levée des réserves de réception. Cette exigence est reprise telle quelle dans le contrat final, sauf négociation explicite actée par écrit entre les parties.</w:t>
       </w:r>
     </w:p>
     <w:p>
@@ -514,7 +514,7 @@
     </w:p>
     <w:p>
       <w:r>
-        <w:t>EF-51. La solution retenue doit permettre la segmentation logique du trafic par direction métier, avec des règles de filtrage indépendantes. Cette exigence conditionne l'adhésion des utilisateurs finaux à la nouvelle solution. La démonstration de cette exigence est intégrée au plan de tests de recette. L'absence de cette fonctionnalité expose le Groupe EB à un risque opérationnel jugé significatif par la Direction des Systèmes d'Information.</w:t>
+        <w:t>EF-51. La solution retenue doit permettre la segmentation logique du trafic par direction métier, avec des règles de filtrage indépendantes. Cette exigence conditionne l'adhésion des utilisateurs finaux à la nouvelle solution. La démonstration de cette exigence est intégrée au plan de tests de recette. L'absence de cette fonctionnalité expose la Société Exemple à un risque opérationnel jugé significatif par la Direction des Systèmes d'Information.</w:t>
       </w:r>
     </w:p>
     <w:p>
@@ -524,17 +524,17 @@
     </w:p>
     <w:p>
       <w:r>
-        <w:t>EF-53. L'outil déployé doit journaliser l'ensemble des opérations sensibles, avec conservation des journaux pendant une durée conforme à la politique interne du Groupe EB. Cette exigence a été formulée à la suite des incidents constatés sur le système actuel. Cette exigence est validée par un test fonctionnel réalisé en présence d'un représentant du Groupe EB. Le Groupe EB se réserve le droit de demander une démonstration anticipée de cette fonctionnalité avant la commande ferme.</w:t>
+        <w:t>EF-53. L'outil déployé doit journaliser l'ensemble des opérations sensibles, avec conservation des journaux pendant une durée conforme à la politique interne de la Société Exemple. Cette exigence a été formulée à la suite des incidents constatés sur le système actuel. Cette exigence est validée par un test fonctionnel réalisé en présence d'un représentant de la Société Exemple. La Société Exemple se réserve le droit de demander une démonstration anticipée de cette fonctionnalité avant la commande ferme.</w:t>
       </w:r>
     </w:p>
     <w:p>
       <w:r>
-        <w:t>EF-54. Le dispositif mis en œuvre doit permettre la révocation immédiate des droits d'un utilisateur quittant le Groupe EB. Cette exigence découle des limites constatées sur la solution actuelle, décrites au chapitre Analyse de l'existant. La démonstration de cette exigence est intégrée au plan de tests de recette. Cette exigence est reprise telle quelle dans le contrat final, sauf négociation explicite actée par écrit entre les parties.</w:t>
+        <w:t>EF-54. Le dispositif mis en œuvre doit permettre la révocation immédiate des droits d'un utilisateur quittant la Société Exemple. Cette exigence découle des limites constatées sur la solution actuelle, décrites au chapitre Analyse de l'existant. La démonstration de cette exigence est intégrée au plan de tests de recette. Cette exigence est reprise telle quelle dans le contrat final, sauf négociation explicite actée par écrit entre les parties.</w:t>
       </w:r>
     </w:p>
     <w:p>
       <w:r>
-        <w:t>EF-55. Le système doit permettre la sauvegarde régulière des données selon une politique définie conjointement avec la Direction des Systèmes d'Information. Cette exigence découle des limites constatées sur la solution actuelle, décrites au chapitre Analyse de l'existant. Cette exigence fait l'objet d'un contrôle contradictoire entre le prestataire et les équipes du Groupe EB. Cette exigence est reprise telle quelle dans le contrat final, sauf négociation explicite actée par écrit entre les parties.</w:t>
+        <w:t>EF-55. Le système doit permettre la sauvegarde régulière des données selon une politique définie conjointement avec la Direction des Systèmes d'Information. Cette exigence découle des limites constatées sur la solution actuelle, décrites au chapitre Analyse de l'existant. Cette exigence fait l'objet d'un contrôle contradictoire entre le prestataire et les équipes de la Société Exemple. Cette exigence est reprise telle quelle dans le contrat final, sauf négociation explicite actée par écrit entre les parties.</w:t>
       </w:r>
     </w:p>
     <w:p>
@@ -549,22 +549,22 @@
     </w:p>
     <w:p>
       <w:r>
-        <w:t>EF-58. Le système doit journaliser l'ensemble des opérations sensibles, avec conservation des journaux pendant une durée conforme à la politique interne du Groupe EB. Cette exigence contribue directement aux objectifs de qualité de service fixés pour la prestation. Le respect de cette exigence conditionne le prononcé de la réception provisoire. Le Groupe EB se réserve le droit de demander une démonstration anticipée de cette fonctionnalité avant la commande ferme.</w:t>
+        <w:t>EF-58. Le système doit journaliser l'ensemble des opérations sensibles, avec conservation des journaux pendant une durée conforme à la politique interne de la Société Exemple. Cette exigence contribue directement aux objectifs de qualité de service fixés pour la prestation. Le respect de cette exigence conditionne le prononcé de la réception provisoire. La Société Exemple se réserve le droit de demander une démonstration anticipée de cette fonctionnalité avant la commande ferme.</w:t>
       </w:r>
     </w:p>
     <w:p>
       <w:r>
-        <w:t>EF-59. L'outil déployé doit permettre la révocation immédiate des droits d'un utilisateur quittant le Groupe EB. Cette exigence répond à un besoin exprimé par les utilisateurs métier lors des ateliers de cadrage. Cette exigence est vérifiée par échantillonnage lors de la période d'observation. Cette exigence a un impact direct sur l'expérience quotidienne des utilisateurs finaux du système.</w:t>
+        <w:t>EF-59. L'outil déployé doit permettre la révocation immédiate des droits d'un utilisateur quittant la Société Exemple. Cette exigence répond à un besoin exprimé par les utilisateurs métier lors des ateliers de cadrage. Cette exigence est vérifiée par échantillonnage lors de la période d'observation. Cette exigence a un impact direct sur l'expérience quotidienne des utilisateurs finaux du système.</w:t>
       </w:r>
     </w:p>
     <w:p>
       <w:r>
-        <w:t>EF-60. La solution retenue doit reposer sur une authentification unique adossée à l'annuaire LDAP du Groupe EB. Cette exigence contribue directement aux objectifs de qualité de service fixés pour la prestation. Le prestataire documente la mise en œuvre de cette exigence dans le dossier de recette. Cette exigence est reprise telle quelle dans le contrat final, sauf négociation explicite actée par écrit entre les parties.</w:t>
+        <w:t>EF-60. La solution retenue doit reposer sur une authentification unique adossée à l'annuaire LDAP de la Société Exemple. Cette exigence contribue directement aux objectifs de qualité de service fixés pour la prestation. Le prestataire documente la mise en œuvre de cette exigence dans le dossier de recette. Cette exigence est reprise telle quelle dans le contrat final, sauf négociation explicite actée par écrit entre les parties.</w:t>
       </w:r>
     </w:p>
     <w:p>
       <w:r>
-        <w:t>EF-61. La solution retenue doit permettre la révocation immédiate des droits d'un utilisateur quittant le Groupe EB. Cette exigence a été formulée à la suite des incidents constatés sur le système actuel. Cette exigence est vérifiée lors de la recette technique, sur la base d'un scénario de test documenté. Le prestataire décrit dans son offre la manière dont il compte répondre à cette exigence, avec le niveau de détail attendu pour une consultation de ce type.</w:t>
+        <w:t>EF-61. La solution retenue doit permettre la révocation immédiate des droits d'un utilisateur quittant la Société Exemple. Cette exigence a été formulée à la suite des incidents constatés sur le système actuel. Cette exigence est vérifiée lors de la recette technique, sur la base d'un scénario de test documenté. Le prestataire décrit dans son offre la manière dont il compte répondre à cette exigence, avec le niveau de détail attendu pour une consultation de ce type.</w:t>
       </w:r>
     </w:p>
     <w:p>
@@ -594,17 +594,17 @@
     </w:p>
     <w:p>
       <w:r>
-        <w:t>EF-67. Le dispositif mis en œuvre doit être disponible en français, langue de travail du Groupe EB, pour l'ensemble des écrans et documents livrés. Cette exigence contribue directement aux objectifs de qualité de service fixés pour la prestation. Cette exigence est validée par un test fonctionnel réalisé en présence d'un représentant du Groupe EB. Cette exigence est reprise telle quelle dans le contrat final, sauf négociation explicite actée par écrit entre les parties.</w:t>
+        <w:t>EF-67. Le dispositif mis en œuvre doit être disponible en français, langue de travail de la Société Exemple, pour l'ensemble des écrans et documents livrés. Cette exigence contribue directement aux objectifs de qualité de service fixés pour la prestation. Cette exigence est validée par un test fonctionnel réalisé en présence d'un représentant de la Société Exemple. Cette exigence est reprise telle quelle dans le contrat final, sauf négociation explicite actée par écrit entre les parties.</w:t>
       </w:r>
     </w:p>
     <w:p>
       <w:r>
-        <w:t>EF-68. L'outil déployé doit journaliser toute modification de configuration des équipements actifs, avec horodatage et identification de l'auteur. Cette exigence vise à réduire le risque opérationnel identifié sur le périmètre actuel. Le non-respect constaté de cette exigence ouvre un délai de reprise avant réception. Le Groupe EB se réserve le droit de demander une démonstration anticipée de cette fonctionnalité avant la commande ferme.</w:t>
+        <w:t>EF-68. L'outil déployé doit journaliser toute modification de configuration des équipements actifs, avec horodatage et identification de l'auteur. Cette exigence vise à réduire le risque opérationnel identifié sur le périmètre actuel. Le non-respect constaté de cette exigence ouvre un délai de reprise avant réception. La Société Exemple se réserve le droit de demander une démonstration anticipée de cette fonctionnalité avant la commande ferme.</w:t>
       </w:r>
     </w:p>
     <w:p>
       <w:r>
-        <w:t>EF-69. L'outil déployé doit reposer sur une authentification unique adossée à l'annuaire LDAP du Groupe EB. Cette exigence découle des limites constatées sur la solution actuelle, décrites au chapitre Analyse de l'existant. Le prestataire documente la mise en œuvre de cette exigence dans le dossier de recette. Le Groupe EB se réserve le droit de demander une démonstration anticipée de cette fonctionnalité avant la commande ferme.</w:t>
+        <w:t>EF-69. L'outil déployé doit reposer sur une authentification unique adossée à l'annuaire LDAP de la Société Exemple. Cette exigence découle des limites constatées sur la solution actuelle, décrites au chapitre Analyse de l'existant. Le prestataire documente la mise en œuvre de cette exigence dans le dossier de recette. La Société Exemple se réserve le droit de demander une démonstration anticipée de cette fonctionnalité avant la commande ferme.</w:t>
       </w:r>
     </w:p>
     <w:p>
@@ -614,12 +614,12 @@
     </w:p>
     <w:p>
       <w:r>
-        <w:t>EF-71. L'outil déployé doit restituer, sur demande du Groupe EB, un état complet des habilitations actives à un instant donné. Cette exigence s'inscrit dans la politique de sécurité du Groupe EB. La démonstration de cette exigence est intégrée au plan de tests de recette. Une réponse partielle à cette exigence doit être explicitement signalée et justifiée dans l'offre du prestataire.</w:t>
+        <w:t>EF-71. L'outil déployé doit restituer, sur demande de la Société Exemple, un état complet des habilitations actives à un instant donné. Cette exigence s'inscrit dans la politique de sécurité de la Société Exemple. La démonstration de cette exigence est intégrée au plan de tests de recette. Une réponse partielle à cette exigence doit être explicitement signalée et justifiée dans l'offre du prestataire.</w:t>
       </w:r>
     </w:p>
     <w:p>
       <w:r>
-        <w:t>EF-72. Le dispositif mis en œuvre doit permettre la remontée d'alerte vers l'équipe d'astreinte en cas d'anomalie bloquante. Cette exigence est jugée prioritaire par la Direction des Systèmes d'Information. Cette exigence est tracée dans la matrice de conformité remise avec l'offre. Le Groupe EB se réserve le droit de demander une démonstration anticipée de cette fonctionnalité avant la commande ferme.</w:t>
+        <w:t>EF-72. Le dispositif mis en œuvre doit permettre la remontée d'alerte vers l'équipe d'astreinte en cas d'anomalie bloquante. Cette exigence est jugée prioritaire par la Direction des Systèmes d'Information. Cette exigence est tracée dans la matrice de conformité remise avec l'offre. La Société Exemple se réserve le droit de demander une démonstration anticipée de cette fonctionnalité avant la commande ferme.</w:t>
       </w:r>
     </w:p>
     <w:p>
@@ -629,7 +629,7 @@
     </w:p>
     <w:p>
       <w:r>
-        <w:t>EF-74. L'application livrée doit permettre la génération d'un rapport mensuel de disponibilité par lien. Cette exigence contribue directement aux objectifs de qualité de service fixés pour la prestation. Cette exigence est tracée dans la matrice de conformité remise avec l'offre. Le Groupe EB se réserve le droit de demander une démonstration anticipée de cette fonctionnalité avant la commande ferme.</w:t>
+        <w:t>EF-74. L'application livrée doit permettre la génération d'un rapport mensuel de disponibilité par lien. Cette exigence contribue directement aux objectifs de qualité de service fixés pour la prestation. Cette exigence est tracée dans la matrice de conformité remise avec l'offre. La Société Exemple se réserve le droit de demander une démonstration anticipée de cette fonctionnalité avant la commande ferme.</w:t>
       </w:r>
     </w:p>
     <w:p>
@@ -639,22 +639,22 @@
     </w:p>
     <w:p>
       <w:r>
-        <w:t>EF-76. L'application livrée doit fournir une documentation d'exploitation permettant aux équipes internes d'assurer le support de premier niveau. Cette exigence est jugée prioritaire par la Direction des Systèmes d'Information. Cette exigence est tracée dans la matrice de conformité remise avec l'offre. Le Groupe EB se réserve le droit de demander une démonstration anticipée de cette fonctionnalité avant la commande ferme.</w:t>
+        <w:t>EF-76. L'application livrée doit fournir une documentation d'exploitation permettant aux équipes internes d'assurer le support de premier niveau. Cette exigence est jugée prioritaire par la Direction des Systèmes d'Information. Cette exigence est tracée dans la matrice de conformité remise avec l'offre. La Société Exemple se réserve le droit de demander une démonstration anticipée de cette fonctionnalité avant la commande ferme.</w:t>
       </w:r>
     </w:p>
     <w:p>
       <w:r>
-        <w:t>EF-77. Le dispositif mis en œuvre doit journaliser l'ensemble des opérations sensibles, avec conservation des journaux pendant une durée conforme à la politique interne du Groupe EB. Cette exigence s'inscrit dans la politique de sécurité du Groupe EB. Le respect de cette exigence conditionne le prononcé de la réception provisoire. Cette exigence a un impact direct sur l'expérience quotidienne des utilisateurs finaux du système.</w:t>
+        <w:t>EF-77. Le dispositif mis en œuvre doit journaliser l'ensemble des opérations sensibles, avec conservation des journaux pendant une durée conforme à la politique interne de la Société Exemple. Cette exigence s'inscrit dans la politique de sécurité de la Société Exemple. Le respect de cette exigence conditionne le prononcé de la réception provisoire. Cette exigence a un impact direct sur l'expérience quotidienne des utilisateurs finaux du système.</w:t>
       </w:r>
     </w:p>
     <w:p>
       <w:r>
-        <w:t>EF-78. Le système doit permettre la restriction d'accès aux équipements d'administration par adresse IP source. Cette exigence contribue directement aux objectifs de qualité de service fixés pour la prestation. Cette exigence est tracée dans la matrice de conformité remise avec l'offre. L'absence de cette fonctionnalité expose le Groupe EB à un risque opérationnel jugé significatif par la Direction des Systèmes d'Information.</w:t>
+        <w:t>EF-78. Le système doit permettre la restriction d'accès aux équipements d'administration par adresse IP source. Cette exigence contribue directement aux objectifs de qualité de service fixés pour la prestation. Cette exigence est tracée dans la matrice de conformité remise avec l'offre. L'absence de cette fonctionnalité expose la Société Exemple à un risque opérationnel jugé significatif par la Direction des Systèmes d'Information.</w:t>
       </w:r>
     </w:p>
     <w:p>
       <w:r>
-        <w:t>EF-79. Le système doit reposer sur une authentification unique adossée à l'annuaire LDAP du Groupe EB. Cette exigence découle des limites constatées sur la solution actuelle, décrites au chapitre Analyse de l'existant. Le respect de cette exigence conditionne le prononcé de la réception provisoire. Cette exigence est reprise telle quelle dans le contrat final, sauf négociation explicite actée par écrit entre les parties.</w:t>
+        <w:t>EF-79. Le système doit reposer sur une authentification unique adossée à l'annuaire LDAP de la Société Exemple. Cette exigence découle des limites constatées sur la solution actuelle, décrites au chapitre Analyse de l'existant. Le respect de cette exigence conditionne le prononcé de la réception provisoire. Cette exigence est reprise telle quelle dans le contrat final, sauf négociation explicite actée par écrit entre les parties.</w:t>
       </w:r>
     </w:p>
     <w:p>
@@ -664,12 +664,12 @@
     </w:p>
     <w:p>
       <w:r>
-        <w:t>EF-81. L'outil déployé doit fournir un mécanisme de restauration après incident sans perte de données au-delà de l'objectif de point de reprise convenu. Cette exigence vise à réduire le risque opérationnel identifié sur le périmètre actuel. Cette exigence fait l'objet d'un contrôle contradictoire entre le prestataire et les équipes du Groupe EB. L'absence de cette fonctionnalité expose le Groupe EB à un risque opérationnel jugé significatif par la Direction des Systèmes d'Information.</w:t>
+        <w:t>EF-81. L'outil déployé doit fournir un mécanisme de restauration après incident sans perte de données au-delà de l'objectif de point de reprise convenu. Cette exigence vise à réduire le risque opérationnel identifié sur le périmètre actuel. Cette exigence fait l'objet d'un contrôle contradictoire entre le prestataire et les équipes de la Société Exemple. L'absence de cette fonctionnalité expose la Société Exemple à un risque opérationnel jugé significatif par la Direction des Systèmes d'Information.</w:t>
       </w:r>
     </w:p>
     <w:p>
       <w:r>
-        <w:t>EF-82. L'application livrée doit permettre la restriction d'accès aux équipements d'administration par adresse IP source. Cette exigence s'inscrit dans la politique de sécurité du Groupe EB. Le non-respect constaté de cette exigence ouvre un délai de reprise avant réception. Le Groupe EB se réserve le droit de demander une démonstration anticipée de cette fonctionnalité avant la commande ferme.</w:t>
+        <w:t>EF-82. L'application livrée doit permettre la restriction d'accès aux équipements d'administration par adresse IP source. Cette exigence s'inscrit dans la politique de sécurité de la Société Exemple. Le non-respect constaté de cette exigence ouvre un délai de reprise avant réception. La Société Exemple se réserve le droit de demander une démonstration anticipée de cette fonctionnalité avant la commande ferme.</w:t>
       </w:r>
     </w:p>
     <w:p>
@@ -679,7 +679,7 @@
     </w:p>
     <w:p>
       <w:r>
-        <w:t>EF-84. La solution retenue doit permettre l'ajout d'un nouveau site raccordé sans interruption de service sur les sites existants. Cette exigence a été formulée à la suite des incidents constatés sur le système actuel. La conformité à cette exigence est un préalable à la levée des réserves de réception. L'absence de cette fonctionnalité expose le Groupe EB à un risque opérationnel jugé significatif par la Direction des Systèmes d'Information.</w:t>
+        <w:t>EF-84. La solution retenue doit permettre l'ajout d'un nouveau site raccordé sans interruption de service sur les sites existants. Cette exigence a été formulée à la suite des incidents constatés sur le système actuel. La conformité à cette exigence est un préalable à la levée des réserves de réception. L'absence de cette fonctionnalité expose la Société Exemple à un risque opérationnel jugé significatif par la Direction des Systèmes d'Information.</w:t>
       </w:r>
     </w:p>
     <w:p>
@@ -790,12 +790,12 @@
     </w:p>
     <w:p>
       <w:r>
-        <w:t>- Charte informatique interne du Groupe EB. Le prestataire s'engage à informer le Groupe EB de toute évolution réglementaire impactant cette exigence.</w:t>
+        <w:t>- Charte informatique interne de la Société Exemple. Le prestataire s'engage à informer la Société Exemple de toute évolution réglementaire impactant cette exigence.</w:t>
       </w:r>
     </w:p>
     <w:p>
       <w:r>
-        <w:t>- Politique de sécurité des systèmes d'information du Groupe EB. Le respect de cette norme est vérifié lors de l'audit de recette.</w:t>
+        <w:t>- Politique de sécurité des systèmes d'information de la Société Exemple. Le respect de cette norme est vérifié lors de l'audit de recette.</w:t>
       </w:r>
     </w:p>
     <w:p>
@@ -805,12 +805,12 @@
     </w:p>
     <w:p>
       <w:r>
-        <w:t>- Réglementation marocaine relative à la protection des données à caractère personnel. Le prestataire s'engage à informer le Groupe EB de toute évolution réglementaire impactant cette exigence.</w:t>
+        <w:t>- Réglementation marocaine relative à la protection des données à caractère personnel. Le prestataire s'engage à informer la Société Exemple de toute évolution réglementaire impactant cette exigence.</w:t>
       </w:r>
     </w:p>
     <w:p>
       <w:r>
-        <w:t>- RFC applicables au routage dynamique. Le prestataire s'engage à informer le Groupe EB de toute évolution réglementaire impactant cette exigence.</w:t>
+        <w:t>- RFC applicables au routage dynamique. Le prestataire s'engage à informer la Société Exemple de toute évolution réglementaire impactant cette exigence.</w:t>
       </w:r>
     </w:p>
     <w:p>
@@ -823,12 +823,12 @@
     </w:p>
     <w:p>
       <w:r>
-        <w:t>Le taux de disponibilité mensuel minimal exigé est de 99,8 %, mesuré sur les heures ouvrées du Groupe EB. La Garantie de Temps d'Intervention (GTI) et la Garantie de Temps de Rétablissement (GTR) sont fixées ci-dessous, en heures ouvrées à compter de l'ouverture du ticket d'incident.</w:t>
+        <w:t>Le taux de disponibilité mensuel minimal exigé est de 99,8 %, mesuré sur les heures ouvrées de la Société Exemple. La Garantie de Temps d'Intervention (GTI) et la Garantie de Temps de Rétablissement (GTR) sont fixées ci-dessous, en heures ouvrées à compter de l'ouverture du ticket d'incident.</w:t>
       </w:r>
     </w:p>
     <w:p>
       <w:r>
-        <w:t>En cas de dépassement de la GTR, le prestataire en informe sans délai le Groupe EB et propose un plan d'action correctif dans les 24 heures suivant le dépassement constaté.</w:t>
+        <w:t>En cas de dépassement de la GTR, le prestataire en informe sans délai la Société Exemple et propose un plan d'action correctif dans les 24 heures suivant le dépassement constaté.</w:t>
       </w:r>
     </w:p>
     <w:p>
@@ -883,12 +883,12 @@
     </w:p>
     <w:p>
       <w:r>
-        <w:t>La disponibilité est calculée mensuellement selon la formule usuelle du temps de fonctionnement rapporté au temps total de la période, hors fenêtres de maintenance planifiée notifiées au préalable au Groupe EB. Un relevé détaillé est transmis chaque début de mois, accompagné de la liste des incidents survenus et de leur temps de résolution respectif.</w:t>
+        <w:t>La disponibilité est calculée mensuellement selon la formule usuelle du temps de fonctionnement rapporté au temps total de la période, hors fenêtres de maintenance planifiée notifiées au préalable à la Société Exemple. Un relevé détaillé est transmis chaque début de mois, accompagné de la liste des incidents survenus et de leur temps de résolution respectif.</w:t>
       </w:r>
     </w:p>
     <w:p>
       <w:r>
-        <w:t>Toute contestation d'un relevé doit être formulée par écrit dans un délai de dix jours ouvrés suivant sa réception, faute de quoi le relevé est réputé accepté par le Groupe EB.</w:t>
+        <w:t>Toute contestation d'un relevé doit être formulée par écrit dans un délai de dix jours ouvrés suivant sa réception, faute de quoi le relevé est réputé accepté par la Société Exemple.</w:t>
       </w:r>
     </w:p>
     <w:p>
@@ -916,12 +916,12 @@
     </w:p>
     <w:p>
       <w:r>
-        <w:t>| Schéma d'implantation des équipements | PDF / Visio | Avant le démarrage des travaux | Rédigé en français, conforme au gabarit documentaire du Groupe EB. |</w:t>
+        <w:t>| Schéma d'implantation des équipements | PDF / Visio | Avant le démarrage des travaux | Rédigé en français, conforme au gabarit documentaire de la Société Exemple. |</w:t>
       </w:r>
     </w:p>
     <w:p>
       <w:r>
-        <w:t>| Rapport de tests de conformité | PDF | Avant la recette | Validé conjointement par le prestataire et le Groupe EB avant diffusion. |</w:t>
+        <w:t>| Rapport de tests de conformité | PDF | Avant la recette | Validé conjointement par le prestataire et la Société Exemple avant diffusion. |</w:t>
       </w:r>
     </w:p>
     <w:p>
@@ -936,7 +936,7 @@
     </w:p>
     <w:p>
       <w:r>
-        <w:t>| Plan de recollement final | PDF / DWG | À la réception définitive | Validé conjointement par le prestataire et le Groupe EB avant diffusion. |</w:t>
+        <w:t>| Plan de recollement final | PDF / DWG | À la réception définitive | Validé conjointement par le prestataire et la Société Exemple avant diffusion. |</w:t>
       </w:r>
     </w:p>
     <w:p>
@@ -946,7 +946,7 @@
     </w:p>
     <w:p>
       <w:r>
-        <w:t>Chaque livrable fait l'objet d'une vérification de conformité par le Groupe EB avant acceptation. Un livrable rejeté est repris par le prestataire sans incidence sur le délai contractuel global, sauf si le rejet résulte d'une modification du périmètre demandée par le Groupe EB.</w:t>
+        <w:t>Chaque livrable fait l'objet d'une vérification de conformité par la Société Exemple avant acceptation. Un livrable rejeté est repris par le prestataire sans incidence sur le délai contractuel global, sauf si le rejet résulte d'une modification du périmètre demandée par la Société Exemple.</w:t>
       </w:r>
     </w:p>
     <w:p>
@@ -959,7 +959,7 @@
     </w:p>
     <w:p>
       <w:r>
-        <w:t>Le projet est découpé en phases successives, chacune donnant lieu à un jalon de validation formalisé par un compte-rendu contradictoire entre le prestataire et le Groupe EB. Le passage à la phase suivante est conditionné à la levée des réserves éventuelles de la phase précédente.</w:t>
+        <w:t>Le projet est découpé en phases successives, chacune donnant lieu à un jalon de validation formalisé par un compte-rendu contradictoire entre le prestataire et la Société Exemple. Le passage à la phase suivante est conditionné à la levée des réserves éventuelles de la phase précédente.</w:t>
       </w:r>
     </w:p>
     <w:p>
@@ -979,7 +979,7 @@
     </w:p>
     <w:p>
       <w:r>
-        <w:t xml:space="preserve">  - Mise à jour du planning détaillé partagé avec le Groupe EB.</w:t>
+        <w:t xml:space="preserve">  - Mise à jour du planning détaillé partagé avec la Société Exemple.</w:t>
       </w:r>
     </w:p>
     <w:p>
@@ -1004,7 +1004,7 @@
     </w:p>
     <w:p>
       <w:r>
-        <w:t xml:space="preserve">  - Point d'avancement hebdomadaire avec le chef de projet Groupe EB.</w:t>
+        <w:t xml:space="preserve">  - Point d'avancement hebdomadaire avec le chef de projet Société Exemple.</w:t>
       </w:r>
     </w:p>
     <w:p>
@@ -1019,7 +1019,7 @@
     </w:p>
     <w:p>
       <w:r>
-        <w:t xml:space="preserve">  - Point d'avancement hebdomadaire avec le chef de projet Groupe EB.</w:t>
+        <w:t xml:space="preserve">  - Point d'avancement hebdomadaire avec le chef de projet Société Exemple.</w:t>
       </w:r>
     </w:p>
     <w:p>
@@ -1049,7 +1049,7 @@
     </w:p>
     <w:p>
       <w:r>
-        <w:t xml:space="preserve">  - Point d'avancement hebdomadaire avec le chef de projet Groupe EB.</w:t>
+        <w:t xml:space="preserve">  - Point d'avancement hebdomadaire avec le chef de projet Société Exemple.</w:t>
       </w:r>
     </w:p>
     <w:p>
@@ -1074,7 +1074,7 @@
     </w:p>
     <w:p>
       <w:r>
-        <w:t xml:space="preserve">  - Point d'avancement hebdomadaire avec le chef de projet Groupe EB.</w:t>
+        <w:t xml:space="preserve">  - Point d'avancement hebdomadaire avec le chef de projet Société Exemple.</w:t>
       </w:r>
     </w:p>
     <w:p>
@@ -1099,12 +1099,12 @@
     </w:p>
     <w:p>
       <w:r>
-        <w:t xml:space="preserve">  - Mise à jour du planning détaillé partagé avec le Groupe EB.</w:t>
+        <w:t xml:space="preserve">  - Mise à jour du planning détaillé partagé avec la Société Exemple.</w:t>
       </w:r>
     </w:p>
     <w:p>
       <w:r>
-        <w:t xml:space="preserve">  - Point d'avancement hebdomadaire avec le chef de projet Groupe EB.</w:t>
+        <w:t xml:space="preserve">  - Point d'avancement hebdomadaire avec le chef de projet Société Exemple.</w:t>
       </w:r>
     </w:p>
     <w:p>
@@ -1124,12 +1124,12 @@
     </w:p>
     <w:p>
       <w:r>
-        <w:t xml:space="preserve">  - Mise à jour du planning détaillé partagé avec le Groupe EB.</w:t>
+        <w:t xml:space="preserve">  - Mise à jour du planning détaillé partagé avec la Société Exemple.</w:t>
       </w:r>
     </w:p>
     <w:p>
       <w:r>
-        <w:t xml:space="preserve">  - Point d'avancement hebdomadaire avec le chef de projet Groupe EB.</w:t>
+        <w:t xml:space="preserve">  - Point d'avancement hebdomadaire avec le chef de projet Société Exemple.</w:t>
       </w:r>
     </w:p>
     <w:p>
@@ -1147,7 +1147,7 @@
     </w:p>
     <w:p>
       <w:r>
-        <w:t>Le respect du calendrier contractuel constitue une obligation essentielle du prestataire. Tout risque de dérive doit être signalé sans délai au Groupe EB, accompagné d'un plan de récupération proposé par le prestataire.</w:t>
+        <w:t>Le respect du calendrier contractuel constitue une obligation essentielle du prestataire. Tout risque de dérive doit être signalé sans délai à la Société Exemple, accompagné d'un plan de récupération proposé par le prestataire.</w:t>
       </w:r>
     </w:p>
     <w:p>
@@ -1157,7 +1157,7 @@
     </w:p>
     <w:p>
       <w:r>
-        <w:t>En cas de retard imputable au prestataire, une pénalité de 0,5 % du montant total du marché est appliquée par jour calendaire de retard. Le montant cumulé des pénalités est plafonné à 5 % du montant du marché. Au-delà de ce plafond, le Groupe EB se réserve le droit de résilier le marché aux torts exclusifs du prestataire, sans préjudice des dommages et intérêts.</w:t>
+        <w:t>En cas de retard imputable au prestataire, une pénalité de 0,5 % du montant total du marché est appliquée par jour calendaire de retard. Le montant cumulé des pénalités est plafonné à 5 % du montant du marché. Au-delà de ce plafond, la Société Exemple se réserve le droit de résilier le marché aux torts exclusifs du prestataire, sans préjudice des dommages et intérêts.</w:t>
       </w:r>
     </w:p>
     <w:p>
@@ -1167,7 +1167,7 @@
     </w:p>
     <w:p>
       <w:r>
-        <w:t>À l'expiration de la garantie, un contrat de maintenance pourra être conclu par avenant, aux conditions tarifaires proposées dans l'offre initiale. Le prestataire communique, avant l'échéance de la garantie, un état des lieux détaillé du périmètre couvert, permettant au Groupe EB d'apprécier l'opportunité de reconduire la relation contractuelle.</w:t>
+        <w:t>À l'expiration de la garantie, un contrat de maintenance pourra être conclu par avenant, aux conditions tarifaires proposées dans l'offre initiale. Le prestataire communique, avant l'échéance de la garantie, un état des lieux détaillé du périmètre couvert, permettant à la Société Exemple d'apprécier l'opportunité de reconduire la relation contractuelle.</w:t>
       </w:r>
     </w:p>
     <w:p>
@@ -1190,7 +1190,7 @@
     </w:p>
     <w:p>
       <w:r>
-        <w:t>Les factures sont établies selon les jalons décrits au chapitre Planning et jalons, et accompagnées des pièces justificatives requises par la Direction Financière du Groupe EB. Toute facture incomplète est retournée au prestataire et suspend le délai de règlement jusqu'à régularisation.</w:t>
+        <w:t>Les factures sont établies selon les jalons décrits au chapitre Planning et jalons, et accompagnées des pièces justificatives requises par la Direction Financière de la Société Exemple. Toute facture incomplète est retournée au prestataire et suspend le délai de règlement jusqu'à régularisation.</w:t>
       </w:r>
     </w:p>
     <w:p>
@@ -1334,7 +1334,7 @@
         <w:b/>
         <w:color w:val="1C3F60"/>
       </w:rPr>
-      <w:t>GROUPE EB — Direction des Systèmes d'Information</w:t>
+      <w:t>SOCIÉTÉ EXEMPLE — Direction des Systèmes d'Information</w:t>
     </w:r>
   </w:p>
 </w:hdr>

</xml_diff>